<commit_message>
Revert "Safe-boot: move bootloop counter to TAMP->BKP1R + FSBL-side bump"
This reverts commit bcf0ab58e4e8866da63b0e2c9b176df9144c1674.
</commit_message>
<xml_diff>
--- a/docs/docx/INTEGRATION_DOC.docx
+++ b/docs/docx/INTEGRATION_DOC.docx
@@ -2,7 +2,7 @@
 <file path=word/document.xml><?xml version="1.0" encoding="utf-8"?>
 <w:document xmlns:w="http://schemas.openxmlformats.org/wordprocessingml/2006/main" xmlns:m="http://schemas.openxmlformats.org/officeDocument/2006/math" xmlns:r="http://schemas.openxmlformats.org/officeDocument/2006/relationships" xmlns:o="urn:schemas-microsoft-com:office:office" xmlns:v="urn:schemas-microsoft-com:vml" xmlns:w10="urn:schemas-microsoft-com:office:word" xmlns:a="http://schemas.openxmlformats.org/drawingml/2006/main" xmlns:pic="http://schemas.openxmlformats.org/drawingml/2006/picture" xmlns:wp="http://schemas.openxmlformats.org/drawingml/2006/wordprocessingDrawing">
   <w:body>
-    <w:bookmarkStart w:id="43" w:name="n6cam-phase-1-integration-document"/>
+    <w:bookmarkStart w:id="42" w:name="n6cam-phase-1-integration-document"/>
     <w:p>
       <w:pPr>
         <w:pStyle w:val="Heading1"/>
@@ -1851,7 +1851,7 @@
     </w:p>
     <w:bookmarkEnd w:id="24"/>
     <w:bookmarkEnd w:id="25"/>
-    <w:bookmarkStart w:id="31" w:name="protocols"/>
+    <w:bookmarkStart w:id="30" w:name="protocols"/>
     <w:p>
       <w:pPr>
         <w:pStyle w:val="Heading2"/>
@@ -3390,542 +3390,13 @@
       </w:r>
     </w:p>
     <w:bookmarkEnd w:id="28"/>
-    <w:bookmarkStart w:id="29" w:name="safe-boot-bootloop-guard"/>
+    <w:bookmarkStart w:id="29" w:name="self-update-protocol-m1-a4"/>
     <w:p>
       <w:pPr>
         <w:pStyle w:val="Heading3"/>
       </w:pPr>
       <w:r>
-        <w:t xml:space="preserve">3.4 Safe-boot / bootloop guard</w:t>
-      </w:r>
-    </w:p>
-    <w:p>
-      <w:pPr>
-        <w:pStyle w:val="FirstParagraph"/>
-      </w:pPr>
-      <w:r>
-        <w:t xml:space="preserve">The FSBL increments a counter in</w:t>
-      </w:r>
-      <w:r>
-        <w:t xml:space="preserve"> </w:t>
-      </w:r>
-      <w:r>
-        <w:rPr>
-          <w:rStyle w:val="VerbatimChar"/>
-        </w:rPr>
-        <w:t xml:space="preserve">TAMP-&gt;BKP1R</w:t>
-      </w:r>
-      <w:r>
-        <w:t xml:space="preserve"> </w:t>
-      </w:r>
-      <w:r>
-        <w:t xml:space="preserve">on every boot, before clock</w:t>
-      </w:r>
-      <w:r>
-        <w:t xml:space="preserve"> </w:t>
-      </w:r>
-      <w:r>
-        <w:t xml:space="preserve">/ xSPI / App-jump — so even App-init crashes (bad model, ATON HW init,</w:t>
-      </w:r>
-      <w:r>
-        <w:t xml:space="preserve"> </w:t>
-      </w:r>
-      <w:r>
-        <w:t xml:space="preserve">camera bring-up) get counted. The App’s</w:t>
-      </w:r>
-      <w:r>
-        <w:t xml:space="preserve"> </w:t>
-      </w:r>
-      <w:r>
-        <w:rPr>
-          <w:rStyle w:val="VerbatimChar"/>
-        </w:rPr>
-        <w:t xml:space="preserve">shell_task</w:t>
-      </w:r>
-      <w:r>
-        <w:t xml:space="preserve"> </w:t>
-      </w:r>
-      <w:r>
-        <w:t xml:space="preserve">reads the counter</w:t>
-      </w:r>
-      <w:r>
-        <w:t xml:space="preserve"> </w:t>
-      </w:r>
-      <w:r>
-        <w:t xml:space="preserve">as soon as it’s up; once it crosses</w:t>
-      </w:r>
-      <w:r>
-        <w:t xml:space="preserve"> </w:t>
-      </w:r>
-      <w:r>
-        <w:rPr>
-          <w:b/>
-          <w:bCs/>
-        </w:rPr>
-        <w:t xml:space="preserve">3</w:t>
-      </w:r>
-      <w:r>
-        <w:t xml:space="preserve"> </w:t>
-      </w:r>
-      <w:r>
-        <w:t xml:space="preserve">consecutive crash reboots, the</w:t>
-      </w:r>
-      <w:r>
-        <w:t xml:space="preserve"> </w:t>
-      </w:r>
-      <w:r>
-        <w:t xml:space="preserve">App enters</w:t>
-      </w:r>
-      <w:r>
-        <w:t xml:space="preserve"> </w:t>
-      </w:r>
-      <w:r>
-        <w:rPr>
-          <w:b/>
-          <w:bCs/>
-        </w:rPr>
-        <w:t xml:space="preserve">safe mode</w:t>
-      </w:r>
-      <w:r>
-        <w:t xml:space="preserve">:</w:t>
-      </w:r>
-    </w:p>
-    <w:p>
-      <w:pPr>
-        <w:pStyle w:val="Compact"/>
-        <w:numPr>
-          <w:ilvl w:val="0"/>
-          <w:numId w:val="1003"/>
-        </w:numPr>
-      </w:pPr>
-      <w:r>
-        <w:t xml:space="preserve">NN auto-start is suppressed (the most common crash vector — bad model</w:t>
-      </w:r>
-      <w:r>
-        <w:t xml:space="preserve"> </w:t>
-      </w:r>
-      <w:r>
-        <w:t xml:space="preserve">weights — can’t run again).</w:t>
-      </w:r>
-    </w:p>
-    <w:p>
-      <w:pPr>
-        <w:pStyle w:val="Compact"/>
-        <w:numPr>
-          <w:ilvl w:val="0"/>
-          <w:numId w:val="1003"/>
-        </w:numPr>
-      </w:pPr>
-      <w:r>
-        <w:t xml:space="preserve">Operator’s CDC shell stays alive;</w:t>
-      </w:r>
-      <w:r>
-        <w:t xml:space="preserve"> </w:t>
-      </w:r>
-      <w:r>
-        <w:rPr>
-          <w:rStyle w:val="VerbatimChar"/>
-        </w:rPr>
-        <w:t xml:space="preserve">update app</w:t>
-      </w:r>
-      <w:r>
-        <w:t xml:space="preserve"> </w:t>
-      </w:r>
-      <w:r>
-        <w:t xml:space="preserve">/</w:t>
-      </w:r>
-      <w:r>
-        <w:t xml:space="preserve"> </w:t>
-      </w:r>
-      <w:r>
-        <w:rPr>
-          <w:rStyle w:val="VerbatimChar"/>
-        </w:rPr>
-        <w:t xml:space="preserve">update model</w:t>
-      </w:r>
-      <w:r>
-        <w:t xml:space="preserve"> </w:t>
-      </w:r>
-      <w:r>
-        <w:t xml:space="preserve">work</w:t>
-      </w:r>
-      <w:r>
-        <w:t xml:space="preserve"> </w:t>
-      </w:r>
-      <w:r>
-        <w:t xml:space="preserve">normally, so the kit recovers without SWD.</w:t>
-      </w:r>
-    </w:p>
-    <w:p>
-      <w:pPr>
-        <w:pStyle w:val="FirstParagraph"/>
-      </w:pPr>
-      <w:r>
-        <w:t xml:space="preserve">After ~30 s of healthy uptime, the App clears</w:t>
-      </w:r>
-      <w:r>
-        <w:t xml:space="preserve"> </w:t>
-      </w:r>
-      <w:r>
-        <w:rPr>
-          <w:rStyle w:val="VerbatimChar"/>
-        </w:rPr>
-        <w:t xml:space="preserve">BKP1R</w:t>
-      </w:r>
-      <w:r>
-        <w:t xml:space="preserve"> </w:t>
-      </w:r>
-      <w:r>
-        <w:t xml:space="preserve">and the next reboot</w:t>
-      </w:r>
-      <w:r>
-        <w:t xml:space="preserve"> </w:t>
-      </w:r>
-      <w:r>
-        <w:t xml:space="preserve">starts the count over.</w:t>
-      </w:r>
-    </w:p>
-    <w:tbl>
-      <w:tblPr>
-        <w:tblStyle w:val="Table"/>
-        <w:tblW w:type="pct" w:w="5000"/>
-        <w:tblLayout w:type="fixed"/>
-        <w:tblLook w:firstRow="1" w:lastRow="0" w:firstColumn="0" w:lastColumn="0" w:noHBand="0" w:noVBand="0" w:val="0020"/>
-      </w:tblPr>
-      <w:tblGrid>
-        <w:gridCol w:w="1980"/>
-        <w:gridCol w:w="1980"/>
-        <w:gridCol w:w="1980"/>
-        <w:gridCol w:w="1980"/>
-      </w:tblGrid>
-      <w:tr>
-        <w:trPr>
-          <w:tblHeader w:val="on"/>
-        </w:trPr>
-        <w:tc>
-          <w:tcPr/>
-          <w:p>
-            <w:pPr>
-              <w:pStyle w:val="Compact"/>
-              <w:jc w:val="left"/>
-            </w:pPr>
-            <w:r>
-              <w:t xml:space="preserve">BKP register</w:t>
-            </w:r>
-          </w:p>
-        </w:tc>
-        <w:tc>
-          <w:tcPr/>
-          <w:p>
-            <w:pPr>
-              <w:pStyle w:val="Compact"/>
-              <w:jc w:val="left"/>
-            </w:pPr>
-            <w:r>
-              <w:t xml:space="preserve">Purpose</w:t>
-            </w:r>
-          </w:p>
-        </w:tc>
-        <w:tc>
-          <w:tcPr/>
-          <w:p>
-            <w:pPr>
-              <w:pStyle w:val="Compact"/>
-              <w:jc w:val="left"/>
-            </w:pPr>
-            <w:r>
-              <w:t xml:space="preserve">Set by</w:t>
-            </w:r>
-          </w:p>
-        </w:tc>
-        <w:tc>
-          <w:tcPr/>
-          <w:p>
-            <w:pPr>
-              <w:pStyle w:val="Compact"/>
-              <w:jc w:val="left"/>
-            </w:pPr>
-            <w:r>
-              <w:t xml:space="preserve">Cleared by</w:t>
-            </w:r>
-          </w:p>
-        </w:tc>
-      </w:tr>
-      <w:tr>
-        <w:tc>
-          <w:tcPr/>
-          <w:p>
-            <w:pPr>
-              <w:pStyle w:val="Compact"/>
-              <w:jc w:val="left"/>
-            </w:pPr>
-            <w:r>
-              <w:rPr>
-                <w:rStyle w:val="VerbatimChar"/>
-              </w:rPr>
-              <w:t xml:space="preserve">BKP0R</w:t>
-            </w:r>
-          </w:p>
-        </w:tc>
-        <w:tc>
-          <w:tcPr/>
-          <w:p>
-            <w:pPr>
-              <w:pStyle w:val="Compact"/>
-              <w:jc w:val="left"/>
-            </w:pPr>
-            <w:r>
-              <w:t xml:space="preserve">Recovery magic</w:t>
-            </w:r>
-            <w:r>
-              <w:t xml:space="preserve"> </w:t>
-            </w:r>
-            <w:r>
-              <w:rPr>
-                <w:rStyle w:val="VerbatimChar"/>
-              </w:rPr>
-              <w:t xml:space="preserve">0xDEADBEEF</w:t>
-            </w:r>
-            <w:r>
-              <w:t xml:space="preserve"> </w:t>
-            </w:r>
-            <w:r>
-              <w:t xml:space="preserve">— halts FSBL pre-xSPI for SWD reflash</w:t>
-            </w:r>
-          </w:p>
-        </w:tc>
-        <w:tc>
-          <w:tcPr/>
-          <w:p>
-            <w:pPr>
-              <w:pStyle w:val="Compact"/>
-              <w:jc w:val="left"/>
-            </w:pPr>
-            <w:r>
-              <w:t xml:space="preserve">App</w:t>
-            </w:r>
-            <w:r>
-              <w:t xml:space="preserve"> </w:t>
-            </w:r>
-            <w:r>
-              <w:rPr>
-                <w:rStyle w:val="VerbatimChar"/>
-              </w:rPr>
-              <w:t xml:space="preserve">recovery</w:t>
-            </w:r>
-            <w:r>
-              <w:t xml:space="preserve"> </w:t>
-            </w:r>
-            <w:r>
-              <w:t xml:space="preserve">cmd</w:t>
-            </w:r>
-          </w:p>
-        </w:tc>
-        <w:tc>
-          <w:tcPr/>
-          <w:p>
-            <w:pPr>
-              <w:pStyle w:val="Compact"/>
-              <w:jc w:val="left"/>
-            </w:pPr>
-            <w:r>
-              <w:t xml:space="preserve">FSBL on next boot</w:t>
-            </w:r>
-          </w:p>
-        </w:tc>
-      </w:tr>
-      <w:tr>
-        <w:tc>
-          <w:tcPr/>
-          <w:p>
-            <w:pPr>
-              <w:pStyle w:val="Compact"/>
-              <w:jc w:val="left"/>
-            </w:pPr>
-            <w:r>
-              <w:rPr>
-                <w:rStyle w:val="VerbatimChar"/>
-              </w:rPr>
-              <w:t xml:space="preserve">BKP1R</w:t>
-            </w:r>
-          </w:p>
-        </w:tc>
-        <w:tc>
-          <w:tcPr/>
-          <w:p>
-            <w:pPr>
-              <w:pStyle w:val="Compact"/>
-              <w:jc w:val="left"/>
-            </w:pPr>
-            <w:r>
-              <w:t xml:space="preserve">Bootloop counter (0–255)</w:t>
-            </w:r>
-          </w:p>
-        </w:tc>
-        <w:tc>
-          <w:tcPr/>
-          <w:p>
-            <w:pPr>
-              <w:pStyle w:val="Compact"/>
-              <w:jc w:val="left"/>
-            </w:pPr>
-            <w:r>
-              <w:t xml:space="preserve">FSBL increments every boot</w:t>
-            </w:r>
-          </w:p>
-        </w:tc>
-        <w:tc>
-          <w:tcPr/>
-          <w:p>
-            <w:pPr>
-              <w:pStyle w:val="Compact"/>
-              <w:jc w:val="left"/>
-            </w:pPr>
-            <w:r>
-              <w:t xml:space="preserve">App after 30 s uptime, or</w:t>
-            </w:r>
-            <w:r>
-              <w:t xml:space="preserve"> </w:t>
-            </w:r>
-            <w:r>
-              <w:rPr>
-                <w:rStyle w:val="VerbatimChar"/>
-              </w:rPr>
-              <w:t xml:space="preserve">safeboot clear</w:t>
-            </w:r>
-          </w:p>
-        </w:tc>
-      </w:tr>
-    </w:tbl>
-    <w:p>
-      <w:pPr>
-        <w:pStyle w:val="BodyText"/>
-      </w:pPr>
-      <w:r>
-        <w:rPr>
-          <w:b/>
-          <w:bCs/>
-        </w:rPr>
-        <w:t xml:space="preserve">Shell command (App side):</w:t>
-      </w:r>
-    </w:p>
-    <w:p>
-      <w:pPr>
-        <w:pStyle w:val="SourceCode"/>
-      </w:pPr>
-      <w:r>
-        <w:rPr>
-          <w:rStyle w:val="VerbatimChar"/>
-        </w:rPr>
-        <w:t xml:space="preserve">&gt; safeboot status         # current counter, threshold, safe-mode flag</w:t>
-      </w:r>
-      <w:r>
-        <w:br/>
-      </w:r>
-      <w:r>
-        <w:rPr>
-          <w:rStyle w:val="VerbatimChar"/>
-        </w:rPr>
-        <w:t xml:space="preserve">boot_count = 1/3, safe_mode = no</w:t>
-      </w:r>
-      <w:r>
-        <w:br/>
-      </w:r>
-      <w:r>
-        <w:rPr>
-          <w:rStyle w:val="VerbatimChar"/>
-        </w:rPr>
-        <w:t xml:space="preserve">safeboot status ok</w:t>
-      </w:r>
-      <w:r>
-        <w:br/>
-      </w:r>
-      <w:r>
-        <w:br/>
-      </w:r>
-      <w:r>
-        <w:rPr>
-          <w:rStyle w:val="VerbatimChar"/>
-        </w:rPr>
-        <w:t xml:space="preserve">&gt; safeboot clear          # zero the counter (use after fixing root cause)</w:t>
-      </w:r>
-      <w:r>
-        <w:br/>
-      </w:r>
-      <w:r>
-        <w:rPr>
-          <w:rStyle w:val="VerbatimChar"/>
-        </w:rPr>
-        <w:t xml:space="preserve">&gt; safeboot test           # force counter to 3 and reboot — verifies safe</w:t>
-      </w:r>
-      <w:r>
-        <w:br/>
-      </w:r>
-      <w:r>
-        <w:rPr>
-          <w:rStyle w:val="VerbatimChar"/>
-        </w:rPr>
-        <w:t xml:space="preserve">                          # mode engages correctly (DEV USE ONLY)</w:t>
-      </w:r>
-    </w:p>
-    <w:p>
-      <w:pPr>
-        <w:pStyle w:val="FirstParagraph"/>
-      </w:pPr>
-      <w:r>
-        <w:t xml:space="preserve">This closes the only remaining</w:t>
-      </w:r>
-      <w:r>
-        <w:t xml:space="preserve"> </w:t>
-      </w:r>
-      <w:r>
-        <w:t xml:space="preserve">“</w:t>
-      </w:r>
-      <w:r>
-        <w:t xml:space="preserve">needs JTAG</w:t>
-      </w:r>
-      <w:r>
-        <w:t xml:space="preserve">”</w:t>
-      </w:r>
-      <w:r>
-        <w:t xml:space="preserve"> </w:t>
-      </w:r>
-      <w:r>
-        <w:t xml:space="preserve">recovery scenario: a bad App</w:t>
-      </w:r>
-      <w:r>
-        <w:t xml:space="preserve"> </w:t>
-      </w:r>
-      <w:r>
-        <w:t xml:space="preserve">or model push that today would require boot-switch + SWD reflash now</w:t>
-      </w:r>
-      <w:r>
-        <w:t xml:space="preserve"> </w:t>
-      </w:r>
-      <w:r>
-        <w:t xml:space="preserve">self-recovers via USB after 3 boot attempts. TAMP survives reset but not</w:t>
-      </w:r>
-      <w:r>
-        <w:t xml:space="preserve"> </w:t>
-      </w:r>
-      <w:r>
-        <w:t xml:space="preserve">power-off, which is the right semantic — a user-initiated power cycle is</w:t>
-      </w:r>
-      <w:r>
-        <w:t xml:space="preserve"> </w:t>
-      </w:r>
-      <w:r>
-        <w:t xml:space="preserve">a fresh start.</w:t>
-      </w:r>
-    </w:p>
-    <w:bookmarkEnd w:id="29"/>
-    <w:bookmarkStart w:id="30" w:name="self-update-protocol-m1-a4"/>
-    <w:p>
-      <w:pPr>
-        <w:pStyle w:val="Heading3"/>
-      </w:pPr>
-      <w:r>
-        <w:t xml:space="preserve">3.5 Self-update protocol (M1 / A4)</w:t>
+        <w:t xml:space="preserve">3.4 Self-update protocol (M1 / A4)</w:t>
       </w:r>
     </w:p>
     <w:p>
@@ -4106,9 +3577,9 @@
         </w:pict>
       </w:r>
     </w:p>
+    <w:bookmarkEnd w:id="29"/>
     <w:bookmarkEnd w:id="30"/>
-    <w:bookmarkEnd w:id="31"/>
-    <w:bookmarkStart w:id="34" w:name="storage-layout"/>
+    <w:bookmarkStart w:id="33" w:name="storage-layout"/>
     <w:p>
       <w:pPr>
         <w:pStyle w:val="Heading2"/>
@@ -4117,7 +3588,7 @@
         <w:t xml:space="preserve">4. Storage layout</w:t>
       </w:r>
     </w:p>
-    <w:bookmarkStart w:id="32" w:name="xspi-nor-mx66uw1g45g-32-mib"/>
+    <w:bookmarkStart w:id="31" w:name="xspi-nor-mx66uw1g45g-32-mib"/>
     <w:p>
       <w:pPr>
         <w:pStyle w:val="Heading3"/>
@@ -4437,8 +3908,8 @@
         </w:tc>
       </w:tr>
     </w:tbl>
-    <w:bookmarkEnd w:id="32"/>
-    <w:bookmarkStart w:id="33" w:name="sd-card-layout"/>
+    <w:bookmarkEnd w:id="31"/>
+    <w:bookmarkStart w:id="32" w:name="sd-card-layout"/>
     <w:p>
       <w:pPr>
         <w:pStyle w:val="Heading3"/>
@@ -4518,9 +3989,9 @@
         </w:pict>
       </w:r>
     </w:p>
+    <w:bookmarkEnd w:id="32"/>
     <w:bookmarkEnd w:id="33"/>
-    <w:bookmarkEnd w:id="34"/>
-    <w:bookmarkStart w:id="35" w:name="performance-characteristics"/>
+    <w:bookmarkStart w:id="34" w:name="performance-characteristics"/>
     <w:p>
       <w:pPr>
         <w:pStyle w:val="Heading2"/>
@@ -4851,8 +4322,8 @@
         </w:pict>
       </w:r>
     </w:p>
-    <w:bookmarkEnd w:id="35"/>
-    <w:bookmarkStart w:id="39" w:name="bench-acceptance-proposal-v4-a5"/>
+    <w:bookmarkEnd w:id="34"/>
+    <w:bookmarkStart w:id="38" w:name="bench-acceptance-proposal-v4-a5"/>
     <w:p>
       <w:pPr>
         <w:pStyle w:val="Heading2"/>
@@ -4861,7 +4332,7 @@
         <w:t xml:space="preserve">6. Bench acceptance (Proposal v4 / A5)</w:t>
       </w:r>
     </w:p>
-    <w:bookmarkStart w:id="36" w:name="quick-smoke-1-min"/>
+    <w:bookmarkStart w:id="35" w:name="quick-smoke-1-min"/>
     <w:p>
       <w:pPr>
         <w:pStyle w:val="Heading3"/>
@@ -4985,236 +4456,236 @@
         <w:t xml:space="preserve">55 PASS / 0 FAIL / 1 SKIP, NN P95 25.5 ms.</w:t>
       </w:r>
     </w:p>
+    <w:bookmarkEnd w:id="35"/>
+    <w:bookmarkStart w:id="36" w:name="h-soak-a5-deliverable"/>
+    <w:p>
+      <w:pPr>
+        <w:pStyle w:val="Heading3"/>
+      </w:pPr>
+      <w:r>
+        <w:t xml:space="preserve">6.2 ≥ 24 h soak (A5 deliverable)</w:t>
+      </w:r>
+    </w:p>
+    <w:p>
+      <w:pPr>
+        <w:pStyle w:val="SourceCode"/>
+      </w:pPr>
+      <w:r>
+        <w:rPr>
+          <w:rStyle w:val="ExtensionTok"/>
+        </w:rPr>
+        <w:t xml:space="preserve">python3</w:t>
+      </w:r>
+      <w:r>
+        <w:rPr>
+          <w:rStyle w:val="NormalTok"/>
+        </w:rPr>
+        <w:t xml:space="preserve"> tools/bench_soak.py </w:t>
+      </w:r>
+      <w:r>
+        <w:rPr>
+          <w:rStyle w:val="AttributeTok"/>
+        </w:rPr>
+        <w:t xml:space="preserve">--hours</w:t>
+      </w:r>
+      <w:r>
+        <w:rPr>
+          <w:rStyle w:val="NormalTok"/>
+        </w:rPr>
+        <w:t xml:space="preserve"> 24</w:t>
+      </w:r>
+    </w:p>
+    <w:p>
+      <w:pPr>
+        <w:pStyle w:val="FirstParagraph"/>
+      </w:pPr>
+      <w:r>
+        <w:t xml:space="preserve">What it does:</w:t>
+      </w:r>
+    </w:p>
+    <w:p>
+      <w:pPr>
+        <w:pStyle w:val="Compact"/>
+        <w:numPr>
+          <w:ilvl w:val="0"/>
+          <w:numId w:val="1003"/>
+        </w:numPr>
+      </w:pPr>
+      <w:r>
+        <w:t xml:space="preserve">Loops the full regression suite (~65 s/iteration → ~1330 iterations / 24 h).</w:t>
+      </w:r>
+    </w:p>
+    <w:p>
+      <w:pPr>
+        <w:pStyle w:val="Compact"/>
+        <w:numPr>
+          <w:ilvl w:val="0"/>
+          <w:numId w:val="1003"/>
+        </w:numPr>
+      </w:pPr>
+      <w:r>
+        <w:t xml:space="preserve">Tracks</w:t>
+      </w:r>
+      <w:r>
+        <w:t xml:space="preserve"> </w:t>
+      </w:r>
+      <w:r>
+        <w:rPr>
+          <w:b/>
+          <w:bCs/>
+        </w:rPr>
+        <w:t xml:space="preserve">kit uptime</w:t>
+      </w:r>
+      <w:r>
+        <w:t xml:space="preserve"> </w:t>
+      </w:r>
+      <w:r>
+        <w:t xml:space="preserve">between iterations — flags any drop as an unexpected reboot.</w:t>
+      </w:r>
+    </w:p>
+    <w:p>
+      <w:pPr>
+        <w:pStyle w:val="Compact"/>
+        <w:numPr>
+          <w:ilvl w:val="0"/>
+          <w:numId w:val="1003"/>
+        </w:numPr>
+      </w:pPr>
+      <w:r>
+        <w:t xml:space="preserve">Logs to</w:t>
+      </w:r>
+      <w:r>
+        <w:t xml:space="preserve"> </w:t>
+      </w:r>
+      <w:r>
+        <w:rPr>
+          <w:rStyle w:val="VerbatimChar"/>
+        </w:rPr>
+        <w:t xml:space="preserve">results/soak-&lt;ts&gt;/soak.csv</w:t>
+      </w:r>
+      <w:r>
+        <w:t xml:space="preserve"> </w:t>
+      </w:r>
+      <w:r>
+        <w:t xml:space="preserve">— per-iteration row:</w:t>
+      </w:r>
+      <w:r>
+        <w:t xml:space="preserve"> </w:t>
+      </w:r>
+      <w:r>
+        <w:rPr>
+          <w:rStyle w:val="VerbatimChar"/>
+        </w:rPr>
+        <w:t xml:space="preserve">wall_s, kit_uptime_s, rebooted, pass, fail, skip, total, test_time_s, nn_med_ms, nn_p95_ms</w:t>
+      </w:r>
+      <w:r>
+        <w:t xml:space="preserve">.</w:t>
+      </w:r>
+    </w:p>
+    <w:p>
+      <w:pPr>
+        <w:pStyle w:val="Compact"/>
+        <w:numPr>
+          <w:ilvl w:val="0"/>
+          <w:numId w:val="1003"/>
+        </w:numPr>
+      </w:pPr>
+      <w:r>
+        <w:t xml:space="preserve">Each iteration also drops a same-numbered HTML report under</w:t>
+      </w:r>
+      <w:r>
+        <w:t xml:space="preserve"> </w:t>
+      </w:r>
+      <w:r>
+        <w:rPr>
+          <w:rStyle w:val="VerbatimChar"/>
+        </w:rPr>
+        <w:t xml:space="preserve">results/soak-&lt;ts&gt;/soak-NNNNN.html</w:t>
+      </w:r>
+      <w:r>
+        <w:t xml:space="preserve">.</w:t>
+      </w:r>
+    </w:p>
+    <w:p>
+      <w:pPr>
+        <w:pStyle w:val="Compact"/>
+        <w:numPr>
+          <w:ilvl w:val="0"/>
+          <w:numId w:val="1003"/>
+        </w:numPr>
+      </w:pPr>
+      <w:r>
+        <w:t xml:space="preserve">Prints a summary at end: total iterations, pass rate, unexpected reboots, NN median + P95 across all samples.</w:t>
+      </w:r>
+    </w:p>
+    <w:p>
+      <w:pPr>
+        <w:pStyle w:val="FirstParagraph"/>
+      </w:pPr>
+      <w:r>
+        <w:rPr>
+          <w:b/>
+          <w:bCs/>
+        </w:rPr>
+        <w:t xml:space="preserve">Pass criterion:</w:t>
+      </w:r>
+      <w:r>
+        <w:t xml:space="preserve"> </w:t>
+      </w:r>
+      <w:r>
+        <w:rPr>
+          <w:rStyle w:val="VerbatimChar"/>
+        </w:rPr>
+        <w:t xml:space="preserve">unexpected_reboots == 0</w:t>
+      </w:r>
+      <w:r>
+        <w:t xml:space="preserve"> </w:t>
+      </w:r>
+      <w:r>
+        <w:t xml:space="preserve">and</w:t>
+      </w:r>
+      <w:r>
+        <w:t xml:space="preserve"> </w:t>
+      </w:r>
+      <w:r>
+        <w:rPr>
+          <w:rStyle w:val="VerbatimChar"/>
+        </w:rPr>
+        <w:t xml:space="preserve">fail == 0</w:t>
+      </w:r>
+      <w:r>
+        <w:t xml:space="preserve"> </w:t>
+      </w:r>
+      <w:r>
+        <w:t xml:space="preserve">over the full window. Verified 6-min smoke (97.5 % pass rate, 0 reboots, NN P95 25.5 ms — only failures are the documented T07.4/T11.6 known issues on cold-start).</w:t>
+      </w:r>
+    </w:p>
     <w:bookmarkEnd w:id="36"/>
-    <w:bookmarkStart w:id="37" w:name="h-soak-a5-deliverable"/>
+    <w:bookmarkStart w:id="37" w:name="Xfab4953f8b6f41750b0a26bd744d5aa85fc09b1"/>
     <w:p>
       <w:pPr>
         <w:pStyle w:val="Heading3"/>
       </w:pPr>
       <w:r>
-        <w:t xml:space="preserve">6.2 ≥ 24 h soak (A5 deliverable)</w:t>
-      </w:r>
-    </w:p>
-    <w:p>
-      <w:pPr>
-        <w:pStyle w:val="SourceCode"/>
-      </w:pPr>
-      <w:r>
-        <w:rPr>
-          <w:rStyle w:val="ExtensionTok"/>
-        </w:rPr>
-        <w:t xml:space="preserve">python3</w:t>
-      </w:r>
-      <w:r>
-        <w:rPr>
-          <w:rStyle w:val="NormalTok"/>
-        </w:rPr>
-        <w:t xml:space="preserve"> tools/bench_soak.py </w:t>
-      </w:r>
-      <w:r>
-        <w:rPr>
-          <w:rStyle w:val="AttributeTok"/>
-        </w:rPr>
-        <w:t xml:space="preserve">--hours</w:t>
-      </w:r>
-      <w:r>
-        <w:rPr>
-          <w:rStyle w:val="NormalTok"/>
-        </w:rPr>
-        <w:t xml:space="preserve"> 24</w:t>
-      </w:r>
-    </w:p>
-    <w:p>
-      <w:pPr>
-        <w:pStyle w:val="FirstParagraph"/>
-      </w:pPr>
-      <w:r>
-        <w:t xml:space="preserve">What it does:</w:t>
-      </w:r>
-    </w:p>
-    <w:p>
-      <w:pPr>
-        <w:pStyle w:val="Compact"/>
+        <w:t xml:space="preserve">6.3 M3 cellular plane validation (when MangOH lands)</w:t>
+      </w:r>
+    </w:p>
+    <w:p>
+      <w:pPr>
         <w:numPr>
           <w:ilvl w:val="0"/>
           <w:numId w:val="1004"/>
         </w:numPr>
       </w:pPr>
       <w:r>
-        <w:t xml:space="preserve">Loops the full regression suite (~65 s/iteration → ~1330 iterations / 24 h).</w:t>
-      </w:r>
-    </w:p>
-    <w:p>
-      <w:pPr>
-        <w:pStyle w:val="Compact"/>
+        <w:t xml:space="preserve">Wire J503 pin 7 (N6 TX) → MangOH UART RX, pin 9 (N6 RX) → MangOH UART TX, pin 11 → MangOH GND. Match 3.3 V logic levels.</w:t>
+      </w:r>
+    </w:p>
+    <w:p>
+      <w:pPr>
         <w:numPr>
           <w:ilvl w:val="0"/>
           <w:numId w:val="1004"/>
-        </w:numPr>
-      </w:pPr>
-      <w:r>
-        <w:t xml:space="preserve">Tracks</w:t>
-      </w:r>
-      <w:r>
-        <w:t xml:space="preserve"> </w:t>
-      </w:r>
-      <w:r>
-        <w:rPr>
-          <w:b/>
-          <w:bCs/>
-        </w:rPr>
-        <w:t xml:space="preserve">kit uptime</w:t>
-      </w:r>
-      <w:r>
-        <w:t xml:space="preserve"> </w:t>
-      </w:r>
-      <w:r>
-        <w:t xml:space="preserve">between iterations — flags any drop as an unexpected reboot.</w:t>
-      </w:r>
-    </w:p>
-    <w:p>
-      <w:pPr>
-        <w:pStyle w:val="Compact"/>
-        <w:numPr>
-          <w:ilvl w:val="0"/>
-          <w:numId w:val="1004"/>
-        </w:numPr>
-      </w:pPr>
-      <w:r>
-        <w:t xml:space="preserve">Logs to</w:t>
-      </w:r>
-      <w:r>
-        <w:t xml:space="preserve"> </w:t>
-      </w:r>
-      <w:r>
-        <w:rPr>
-          <w:rStyle w:val="VerbatimChar"/>
-        </w:rPr>
-        <w:t xml:space="preserve">results/soak-&lt;ts&gt;/soak.csv</w:t>
-      </w:r>
-      <w:r>
-        <w:t xml:space="preserve"> </w:t>
-      </w:r>
-      <w:r>
-        <w:t xml:space="preserve">— per-iteration row:</w:t>
-      </w:r>
-      <w:r>
-        <w:t xml:space="preserve"> </w:t>
-      </w:r>
-      <w:r>
-        <w:rPr>
-          <w:rStyle w:val="VerbatimChar"/>
-        </w:rPr>
-        <w:t xml:space="preserve">wall_s, kit_uptime_s, rebooted, pass, fail, skip, total, test_time_s, nn_med_ms, nn_p95_ms</w:t>
-      </w:r>
-      <w:r>
-        <w:t xml:space="preserve">.</w:t>
-      </w:r>
-    </w:p>
-    <w:p>
-      <w:pPr>
-        <w:pStyle w:val="Compact"/>
-        <w:numPr>
-          <w:ilvl w:val="0"/>
-          <w:numId w:val="1004"/>
-        </w:numPr>
-      </w:pPr>
-      <w:r>
-        <w:t xml:space="preserve">Each iteration also drops a same-numbered HTML report under</w:t>
-      </w:r>
-      <w:r>
-        <w:t xml:space="preserve"> </w:t>
-      </w:r>
-      <w:r>
-        <w:rPr>
-          <w:rStyle w:val="VerbatimChar"/>
-        </w:rPr>
-        <w:t xml:space="preserve">results/soak-&lt;ts&gt;/soak-NNNNN.html</w:t>
-      </w:r>
-      <w:r>
-        <w:t xml:space="preserve">.</w:t>
-      </w:r>
-    </w:p>
-    <w:p>
-      <w:pPr>
-        <w:pStyle w:val="Compact"/>
-        <w:numPr>
-          <w:ilvl w:val="0"/>
-          <w:numId w:val="1004"/>
-        </w:numPr>
-      </w:pPr>
-      <w:r>
-        <w:t xml:space="preserve">Prints a summary at end: total iterations, pass rate, unexpected reboots, NN median + P95 across all samples.</w:t>
-      </w:r>
-    </w:p>
-    <w:p>
-      <w:pPr>
-        <w:pStyle w:val="FirstParagraph"/>
-      </w:pPr>
-      <w:r>
-        <w:rPr>
-          <w:b/>
-          <w:bCs/>
-        </w:rPr>
-        <w:t xml:space="preserve">Pass criterion:</w:t>
-      </w:r>
-      <w:r>
-        <w:t xml:space="preserve"> </w:t>
-      </w:r>
-      <w:r>
-        <w:rPr>
-          <w:rStyle w:val="VerbatimChar"/>
-        </w:rPr>
-        <w:t xml:space="preserve">unexpected_reboots == 0</w:t>
-      </w:r>
-      <w:r>
-        <w:t xml:space="preserve"> </w:t>
-      </w:r>
-      <w:r>
-        <w:t xml:space="preserve">and</w:t>
-      </w:r>
-      <w:r>
-        <w:t xml:space="preserve"> </w:t>
-      </w:r>
-      <w:r>
-        <w:rPr>
-          <w:rStyle w:val="VerbatimChar"/>
-        </w:rPr>
-        <w:t xml:space="preserve">fail == 0</w:t>
-      </w:r>
-      <w:r>
-        <w:t xml:space="preserve"> </w:t>
-      </w:r>
-      <w:r>
-        <w:t xml:space="preserve">over the full window. Verified 6-min smoke (97.5 % pass rate, 0 reboots, NN P95 25.5 ms — only failures are the documented T07.4/T11.6 known issues on cold-start).</w:t>
-      </w:r>
-    </w:p>
-    <w:bookmarkEnd w:id="37"/>
-    <w:bookmarkStart w:id="38" w:name="Xfab4953f8b6f41750b0a26bd744d5aa85fc09b1"/>
-    <w:p>
-      <w:pPr>
-        <w:pStyle w:val="Heading3"/>
-      </w:pPr>
-      <w:r>
-        <w:t xml:space="preserve">6.3 M3 cellular plane validation (when MangOH lands)</w:t>
-      </w:r>
-    </w:p>
-    <w:p>
-      <w:pPr>
-        <w:numPr>
-          <w:ilvl w:val="0"/>
-          <w:numId w:val="1005"/>
-        </w:numPr>
-      </w:pPr>
-      <w:r>
-        <w:t xml:space="preserve">Wire J503 pin 7 (N6 TX) → MangOH UART RX, pin 9 (N6 RX) → MangOH UART TX, pin 11 → MangOH GND. Match 3.3 V logic levels.</w:t>
-      </w:r>
-    </w:p>
-    <w:p>
-      <w:pPr>
-        <w:numPr>
-          <w:ilvl w:val="0"/>
-          <w:numId w:val="1005"/>
         </w:numPr>
       </w:pPr>
       <w:r>
@@ -5285,7 +4756,7 @@
       <w:pPr>
         <w:numPr>
           <w:ilvl w:val="0"/>
-          <w:numId w:val="1005"/>
+          <w:numId w:val="1004"/>
         </w:numPr>
       </w:pPr>
       <w:r>
@@ -5325,9 +4796,9 @@
         </w:pict>
       </w:r>
     </w:p>
+    <w:bookmarkEnd w:id="37"/>
     <w:bookmarkEnd w:id="38"/>
-    <w:bookmarkEnd w:id="39"/>
-    <w:bookmarkStart w:id="40" w:name="known-limitations"/>
+    <w:bookmarkStart w:id="39" w:name="known-limitations"/>
     <w:p>
       <w:pPr>
         <w:pStyle w:val="Heading2"/>
@@ -5532,8 +5003,8 @@
         </w:pict>
       </w:r>
     </w:p>
-    <w:bookmarkEnd w:id="40"/>
-    <w:bookmarkStart w:id="41" w:name="repository-layout"/>
+    <w:bookmarkEnd w:id="39"/>
+    <w:bookmarkStart w:id="40" w:name="repository-layout"/>
     <w:p>
       <w:pPr>
         <w:pStyle w:val="Heading2"/>
@@ -5866,8 +5337,8 @@
         </w:pict>
       </w:r>
     </w:p>
-    <w:bookmarkEnd w:id="41"/>
-    <w:bookmarkStart w:id="42" w:name="tags-on-master"/>
+    <w:bookmarkEnd w:id="40"/>
+    <w:bookmarkStart w:id="41" w:name="tags-on-master"/>
     <w:p>
       <w:pPr>
         <w:pStyle w:val="Heading2"/>
@@ -6278,8 +5749,8 @@
         <w:t xml:space="preserve">for individual commits.</w:t>
       </w:r>
     </w:p>
+    <w:bookmarkEnd w:id="41"/>
     <w:bookmarkEnd w:id="42"/>
-    <w:bookmarkEnd w:id="43"/>
     <w:sectPr/>
   </w:body>
 </w:document>
@@ -6587,9 +6058,6 @@
     <w:abstractNumId w:val="991"/>
   </w:num>
   <w:num w:numId="1004">
-    <w:abstractNumId w:val="991"/>
-  </w:num>
-  <w:num w:numId="1005">
     <w:abstractNumId w:val="99411"/>
     <w:lvlOverride w:ilvl="0">
       <w:startOverride w:val="1"/>

</xml_diff>